<commit_message>
Updated Lab Task 04 Screenshots
</commit_message>
<xml_diff>
--- a/lab4.docx
+++ b/lab4.docx
@@ -3,8 +3,62 @@
 <w:document xmlns:wpc="http://schemas.microsoft.com/office/word/2010/wordprocessingCanvas" xmlns:mc="http://schemas.openxmlformats.org/markup-compatibility/2006" xmlns:o="urn:schemas-microsoft-com:office:office" xmlns:r="http://schemas.openxmlformats.org/officeDocument/2006/relationships" xmlns:m="http://schemas.openxmlformats.org/officeDocument/2006/math" xmlns:v="urn:schemas-microsoft-com:vml" xmlns:wp14="http://schemas.microsoft.com/office/word/2010/wordprocessingDrawing" xmlns:wp="http://schemas.openxmlformats.org/drawingml/2006/wordprocessingDrawing" xmlns:w10="urn:schemas-microsoft-com:office:word" xmlns:w="http://schemas.openxmlformats.org/wordprocessingml/2006/main" xmlns:w14="http://schemas.microsoft.com/office/word/2010/wordml" xmlns:w15="http://schemas.microsoft.com/office/word/2012/wordml" xmlns:wpg="http://schemas.microsoft.com/office/word/2010/wordprocessingGroup" xmlns:wpi="http://schemas.microsoft.com/office/word/2010/wordprocessingInk" xmlns:wne="http://schemas.microsoft.com/office/word/2006/wordml" xmlns:wps="http://schemas.microsoft.com/office/word/2010/wordprocessingShape" mc:Ignorable="w14 w15 wp14">
   <w:body>
     <w:p>
+      <w:pPr>
+        <w:jc w:val="center"/>
+        <w:rPr>
+          <w:rFonts w:ascii="Times New Roman" w:hAnsi="Times New Roman" w:cs="Times New Roman"/>
+          <w:b/>
+          <w:sz w:val="32"/>
+          <w:szCs w:val="32"/>
+        </w:rPr>
+      </w:pPr>
+      <w:r>
+        <w:rPr>
+          <w:rFonts w:ascii="Times New Roman" w:hAnsi="Times New Roman" w:cs="Times New Roman"/>
+          <w:b/>
+          <w:sz w:val="32"/>
+          <w:szCs w:val="32"/>
+        </w:rPr>
+        <w:t>LAB TASK 04 OUPUTS SCREENSHOT</w:t>
+      </w:r>
       <w:bookmarkStart w:id="0" w:name="_GoBack"/>
-      <w:r>
+      <w:bookmarkEnd w:id="0"/>
+    </w:p>
+    <w:p>
+      <w:pPr>
+        <w:rPr>
+          <w:rFonts w:ascii="Times New Roman" w:hAnsi="Times New Roman" w:cs="Times New Roman"/>
+          <w:b/>
+          <w:sz w:val="32"/>
+          <w:szCs w:val="32"/>
+        </w:rPr>
+      </w:pPr>
+      <w:r>
+        <w:rPr>
+          <w:rFonts w:ascii="Times New Roman" w:hAnsi="Times New Roman" w:cs="Times New Roman"/>
+          <w:b/>
+          <w:sz w:val="32"/>
+          <w:szCs w:val="32"/>
+        </w:rPr>
+        <w:t>Starter code output:</w:t>
+      </w:r>
+      <w:r>
+        <w:rPr>
+          <w:rFonts w:ascii="Times New Roman" w:hAnsi="Times New Roman" w:cs="Times New Roman"/>
+          <w:b/>
+          <w:sz w:val="32"/>
+          <w:szCs w:val="32"/>
+        </w:rPr>
+        <w:t xml:space="preserve"> </w:t>
+      </w:r>
+      <w:r>
+        <w:rPr>
+          <w:rFonts w:ascii="Times New Roman" w:hAnsi="Times New Roman" w:cs="Times New Roman"/>
+          <w:b/>
+          <w:noProof/>
+          <w:sz w:val="32"/>
+          <w:szCs w:val="32"/>
+        </w:rPr>
         <w:drawing>
           <wp:inline distT="0" distB="0" distL="0" distR="0" wp14:anchorId="0C22B1D2" wp14:editId="6F4D03A1">
             <wp:extent cx="5943600" cy="1463675"/>
@@ -41,13 +95,30 @@
           </wp:inline>
         </w:drawing>
       </w:r>
-      <w:bookmarkEnd w:id="0"/>
-      <w:r>
+      <w:r>
+        <w:rPr>
+          <w:rFonts w:ascii="Times New Roman" w:hAnsi="Times New Roman" w:cs="Times New Roman"/>
+          <w:b/>
+          <w:sz w:val="32"/>
+          <w:szCs w:val="32"/>
+        </w:rPr>
         <w:t>Step1</w:t>
       </w:r>
-    </w:p>
-    <w:p>
-      <w:r>
+      <w:r>
+        <w:rPr>
+          <w:rFonts w:ascii="Times New Roman" w:hAnsi="Times New Roman" w:cs="Times New Roman"/>
+          <w:b/>
+          <w:sz w:val="32"/>
+          <w:szCs w:val="32"/>
+        </w:rPr>
+        <w:t xml:space="preserve"> output:</w:t>
+      </w:r>
+    </w:p>
+    <w:p>
+      <w:r>
+        <w:rPr>
+          <w:noProof/>
+        </w:rPr>
         <w:drawing>
           <wp:inline distT="0" distB="0" distL="0" distR="0" wp14:anchorId="3FDFF3A5" wp14:editId="36460E88">
             <wp:extent cx="5943600" cy="2479040"/>
@@ -87,12 +158,38 @@
     </w:p>
     <w:p/>
     <w:p>
-      <w:r>
+      <w:pPr>
+        <w:rPr>
+          <w:rFonts w:ascii="Times New Roman" w:hAnsi="Times New Roman" w:cs="Times New Roman"/>
+          <w:b/>
+          <w:sz w:val="32"/>
+          <w:szCs w:val="32"/>
+        </w:rPr>
+      </w:pPr>
+      <w:r>
+        <w:rPr>
+          <w:rFonts w:ascii="Times New Roman" w:hAnsi="Times New Roman" w:cs="Times New Roman"/>
+          <w:b/>
+          <w:sz w:val="32"/>
+          <w:szCs w:val="32"/>
+        </w:rPr>
         <w:t>Step2</w:t>
       </w:r>
-    </w:p>
-    <w:p>
-      <w:r>
+      <w:r>
+        <w:rPr>
+          <w:rFonts w:ascii="Times New Roman" w:hAnsi="Times New Roman" w:cs="Times New Roman"/>
+          <w:b/>
+          <w:sz w:val="32"/>
+          <w:szCs w:val="32"/>
+        </w:rPr>
+        <w:t xml:space="preserve"> output:</w:t>
+      </w:r>
+    </w:p>
+    <w:p>
+      <w:r>
+        <w:rPr>
+          <w:noProof/>
+        </w:rPr>
         <w:drawing>
           <wp:inline distT="0" distB="0" distL="0" distR="0" wp14:anchorId="499CE135" wp14:editId="2CF2A813">
             <wp:extent cx="5943600" cy="2056765"/>
@@ -131,14 +228,41 @@
       </w:r>
     </w:p>
     <w:p/>
-    <w:p>
-      <w:r>
-        <w:t>Step 3</w:t>
-      </w:r>
-    </w:p>
-    <w:p>
-      <w:r>
-        <w:lastRenderedPageBreak/>
+    <w:p/>
+    <w:p>
+      <w:pPr>
+        <w:rPr>
+          <w:rFonts w:ascii="Times New Roman" w:hAnsi="Times New Roman" w:cs="Times New Roman"/>
+          <w:b/>
+          <w:sz w:val="32"/>
+          <w:szCs w:val="32"/>
+        </w:rPr>
+      </w:pPr>
+      <w:r>
+        <w:rPr>
+          <w:rFonts w:ascii="Times New Roman" w:hAnsi="Times New Roman" w:cs="Times New Roman"/>
+          <w:b/>
+          <w:sz w:val="32"/>
+          <w:szCs w:val="32"/>
+        </w:rPr>
+        <w:t>Step3</w:t>
+      </w:r>
+      <w:r>
+        <w:rPr>
+          <w:rFonts w:ascii="Times New Roman" w:hAnsi="Times New Roman" w:cs="Times New Roman"/>
+          <w:b/>
+          <w:sz w:val="32"/>
+          <w:szCs w:val="32"/>
+        </w:rPr>
+        <w:t xml:space="preserve"> output:</w:t>
+      </w:r>
+    </w:p>
+    <w:p/>
+    <w:p>
+      <w:r>
+        <w:rPr>
+          <w:noProof/>
+        </w:rPr>
         <w:drawing>
           <wp:inline distT="0" distB="0" distL="0" distR="0" wp14:anchorId="180D5950" wp14:editId="612AF85D">
             <wp:extent cx="5943600" cy="2948305"/>
@@ -178,12 +302,38 @@
     </w:p>
     <w:p/>
     <w:p>
-      <w:r>
-        <w:t>Step 4</w:t>
-      </w:r>
-    </w:p>
-    <w:p>
-      <w:r>
+      <w:pPr>
+        <w:rPr>
+          <w:rFonts w:ascii="Times New Roman" w:hAnsi="Times New Roman" w:cs="Times New Roman"/>
+          <w:b/>
+          <w:sz w:val="32"/>
+          <w:szCs w:val="32"/>
+        </w:rPr>
+      </w:pPr>
+      <w:r>
+        <w:rPr>
+          <w:rFonts w:ascii="Times New Roman" w:hAnsi="Times New Roman" w:cs="Times New Roman"/>
+          <w:b/>
+          <w:sz w:val="32"/>
+          <w:szCs w:val="32"/>
+        </w:rPr>
+        <w:t>Step4</w:t>
+      </w:r>
+      <w:r>
+        <w:rPr>
+          <w:rFonts w:ascii="Times New Roman" w:hAnsi="Times New Roman" w:cs="Times New Roman"/>
+          <w:b/>
+          <w:sz w:val="32"/>
+          <w:szCs w:val="32"/>
+        </w:rPr>
+        <w:t xml:space="preserve"> output:</w:t>
+      </w:r>
+    </w:p>
+    <w:p>
+      <w:r>
+        <w:rPr>
+          <w:noProof/>
+        </w:rPr>
         <w:drawing>
           <wp:inline distT="0" distB="0" distL="0" distR="0" wp14:anchorId="59BFAF31" wp14:editId="0A71BDCB">
             <wp:extent cx="5943600" cy="3540125"/>
@@ -221,15 +371,81 @@
         </w:drawing>
       </w:r>
     </w:p>
-    <w:p/>
-    <w:p>
-      <w:r>
-        <w:t>Step 5</w:t>
-      </w:r>
-    </w:p>
-    <w:p>
-      <w:r>
-        <w:lastRenderedPageBreak/>
+    <w:p>
+      <w:pPr>
+        <w:rPr>
+          <w:rFonts w:ascii="Times New Roman" w:hAnsi="Times New Roman" w:cs="Times New Roman"/>
+          <w:b/>
+          <w:sz w:val="32"/>
+          <w:szCs w:val="32"/>
+        </w:rPr>
+      </w:pPr>
+    </w:p>
+    <w:p>
+      <w:pPr>
+        <w:rPr>
+          <w:rFonts w:ascii="Times New Roman" w:hAnsi="Times New Roman" w:cs="Times New Roman"/>
+          <w:b/>
+          <w:sz w:val="32"/>
+          <w:szCs w:val="32"/>
+        </w:rPr>
+      </w:pPr>
+    </w:p>
+    <w:p>
+      <w:pPr>
+        <w:rPr>
+          <w:rFonts w:ascii="Times New Roman" w:hAnsi="Times New Roman" w:cs="Times New Roman"/>
+          <w:b/>
+          <w:sz w:val="32"/>
+          <w:szCs w:val="32"/>
+        </w:rPr>
+      </w:pPr>
+    </w:p>
+    <w:p>
+      <w:pPr>
+        <w:rPr>
+          <w:rFonts w:ascii="Times New Roman" w:hAnsi="Times New Roman" w:cs="Times New Roman"/>
+          <w:b/>
+          <w:sz w:val="32"/>
+          <w:szCs w:val="32"/>
+        </w:rPr>
+      </w:pPr>
+    </w:p>
+    <w:p>
+      <w:pPr>
+        <w:rPr>
+          <w:rFonts w:ascii="Times New Roman" w:hAnsi="Times New Roman" w:cs="Times New Roman"/>
+          <w:b/>
+          <w:sz w:val="32"/>
+          <w:szCs w:val="32"/>
+        </w:rPr>
+      </w:pPr>
+    </w:p>
+    <w:p>
+      <w:r>
+        <w:rPr>
+          <w:rFonts w:ascii="Times New Roman" w:hAnsi="Times New Roman" w:cs="Times New Roman"/>
+          <w:b/>
+          <w:sz w:val="32"/>
+          <w:szCs w:val="32"/>
+        </w:rPr>
+        <w:t>Step5</w:t>
+      </w:r>
+      <w:r>
+        <w:rPr>
+          <w:rFonts w:ascii="Times New Roman" w:hAnsi="Times New Roman" w:cs="Times New Roman"/>
+          <w:b/>
+          <w:sz w:val="32"/>
+          <w:szCs w:val="32"/>
+        </w:rPr>
+        <w:t xml:space="preserve"> output:</w:t>
+      </w:r>
+    </w:p>
+    <w:p>
+      <w:r>
+        <w:rPr>
+          <w:noProof/>
+        </w:rPr>
         <w:drawing>
           <wp:inline distT="0" distB="0" distL="0" distR="0" wp14:anchorId="03C6AE60" wp14:editId="45207F74">
             <wp:extent cx="5943600" cy="3869055"/>
@@ -269,13 +485,136 @@
     </w:p>
     <w:p/>
     <w:p>
-      <w:r>
-        <w:t>Step 6</w:t>
-      </w:r>
-    </w:p>
-    <w:p>
-      <w:r>
-        <w:lastRenderedPageBreak/>
+      <w:pPr>
+        <w:rPr>
+          <w:rFonts w:ascii="Times New Roman" w:hAnsi="Times New Roman" w:cs="Times New Roman"/>
+          <w:b/>
+          <w:sz w:val="32"/>
+          <w:szCs w:val="32"/>
+        </w:rPr>
+      </w:pPr>
+    </w:p>
+    <w:p>
+      <w:pPr>
+        <w:rPr>
+          <w:rFonts w:ascii="Times New Roman" w:hAnsi="Times New Roman" w:cs="Times New Roman"/>
+          <w:b/>
+          <w:sz w:val="32"/>
+          <w:szCs w:val="32"/>
+        </w:rPr>
+      </w:pPr>
+    </w:p>
+    <w:p>
+      <w:pPr>
+        <w:rPr>
+          <w:rFonts w:ascii="Times New Roman" w:hAnsi="Times New Roman" w:cs="Times New Roman"/>
+          <w:b/>
+          <w:sz w:val="32"/>
+          <w:szCs w:val="32"/>
+        </w:rPr>
+      </w:pPr>
+    </w:p>
+    <w:p>
+      <w:pPr>
+        <w:rPr>
+          <w:rFonts w:ascii="Times New Roman" w:hAnsi="Times New Roman" w:cs="Times New Roman"/>
+          <w:b/>
+          <w:sz w:val="32"/>
+          <w:szCs w:val="32"/>
+        </w:rPr>
+      </w:pPr>
+    </w:p>
+    <w:p>
+      <w:pPr>
+        <w:rPr>
+          <w:rFonts w:ascii="Times New Roman" w:hAnsi="Times New Roman" w:cs="Times New Roman"/>
+          <w:b/>
+          <w:sz w:val="32"/>
+          <w:szCs w:val="32"/>
+        </w:rPr>
+      </w:pPr>
+    </w:p>
+    <w:p>
+      <w:pPr>
+        <w:rPr>
+          <w:rFonts w:ascii="Times New Roman" w:hAnsi="Times New Roman" w:cs="Times New Roman"/>
+          <w:b/>
+          <w:sz w:val="32"/>
+          <w:szCs w:val="32"/>
+        </w:rPr>
+      </w:pPr>
+    </w:p>
+    <w:p>
+      <w:pPr>
+        <w:rPr>
+          <w:rFonts w:ascii="Times New Roman" w:hAnsi="Times New Roman" w:cs="Times New Roman"/>
+          <w:b/>
+          <w:sz w:val="32"/>
+          <w:szCs w:val="32"/>
+        </w:rPr>
+      </w:pPr>
+    </w:p>
+    <w:p>
+      <w:pPr>
+        <w:rPr>
+          <w:rFonts w:ascii="Times New Roman" w:hAnsi="Times New Roman" w:cs="Times New Roman"/>
+          <w:b/>
+          <w:sz w:val="32"/>
+          <w:szCs w:val="32"/>
+        </w:rPr>
+      </w:pPr>
+    </w:p>
+    <w:p>
+      <w:pPr>
+        <w:rPr>
+          <w:rFonts w:ascii="Times New Roman" w:hAnsi="Times New Roman" w:cs="Times New Roman"/>
+          <w:b/>
+          <w:sz w:val="32"/>
+          <w:szCs w:val="32"/>
+        </w:rPr>
+      </w:pPr>
+    </w:p>
+    <w:p>
+      <w:pPr>
+        <w:rPr>
+          <w:rFonts w:ascii="Times New Roman" w:hAnsi="Times New Roman" w:cs="Times New Roman"/>
+          <w:b/>
+          <w:sz w:val="32"/>
+          <w:szCs w:val="32"/>
+        </w:rPr>
+      </w:pPr>
+    </w:p>
+    <w:p>
+      <w:pPr>
+        <w:rPr>
+          <w:rFonts w:ascii="Times New Roman" w:hAnsi="Times New Roman" w:cs="Times New Roman"/>
+          <w:b/>
+          <w:sz w:val="32"/>
+          <w:szCs w:val="32"/>
+        </w:rPr>
+      </w:pPr>
+      <w:r>
+        <w:rPr>
+          <w:rFonts w:ascii="Times New Roman" w:hAnsi="Times New Roman" w:cs="Times New Roman"/>
+          <w:b/>
+          <w:sz w:val="32"/>
+          <w:szCs w:val="32"/>
+        </w:rPr>
+        <w:t>Step6</w:t>
+      </w:r>
+      <w:r>
+        <w:rPr>
+          <w:rFonts w:ascii="Times New Roman" w:hAnsi="Times New Roman" w:cs="Times New Roman"/>
+          <w:b/>
+          <w:sz w:val="32"/>
+          <w:szCs w:val="32"/>
+        </w:rPr>
+        <w:t xml:space="preserve"> output:</w:t>
+      </w:r>
+      <w:r>
+        <w:rPr>
+          <w:noProof/>
+        </w:rPr>
         <w:drawing>
           <wp:inline distT="0" distB="0" distL="0" distR="0" wp14:anchorId="690D8C83" wp14:editId="685CC948">
             <wp:extent cx="5943600" cy="4010025"/>
@@ -315,13 +654,138 @@
     </w:p>
     <w:p/>
     <w:p>
-      <w:r>
-        <w:t>Step 7</w:t>
-      </w:r>
-    </w:p>
-    <w:p>
-      <w:r>
-        <w:lastRenderedPageBreak/>
+      <w:pPr>
+        <w:rPr>
+          <w:rFonts w:ascii="Times New Roman" w:hAnsi="Times New Roman" w:cs="Times New Roman"/>
+          <w:b/>
+          <w:sz w:val="32"/>
+          <w:szCs w:val="32"/>
+        </w:rPr>
+      </w:pPr>
+    </w:p>
+    <w:p>
+      <w:pPr>
+        <w:rPr>
+          <w:rFonts w:ascii="Times New Roman" w:hAnsi="Times New Roman" w:cs="Times New Roman"/>
+          <w:b/>
+          <w:sz w:val="32"/>
+          <w:szCs w:val="32"/>
+        </w:rPr>
+      </w:pPr>
+    </w:p>
+    <w:p>
+      <w:pPr>
+        <w:rPr>
+          <w:rFonts w:ascii="Times New Roman" w:hAnsi="Times New Roman" w:cs="Times New Roman"/>
+          <w:b/>
+          <w:sz w:val="32"/>
+          <w:szCs w:val="32"/>
+        </w:rPr>
+      </w:pPr>
+    </w:p>
+    <w:p>
+      <w:pPr>
+        <w:rPr>
+          <w:rFonts w:ascii="Times New Roman" w:hAnsi="Times New Roman" w:cs="Times New Roman"/>
+          <w:b/>
+          <w:sz w:val="32"/>
+          <w:szCs w:val="32"/>
+        </w:rPr>
+      </w:pPr>
+    </w:p>
+    <w:p>
+      <w:pPr>
+        <w:rPr>
+          <w:rFonts w:ascii="Times New Roman" w:hAnsi="Times New Roman" w:cs="Times New Roman"/>
+          <w:b/>
+          <w:sz w:val="32"/>
+          <w:szCs w:val="32"/>
+        </w:rPr>
+      </w:pPr>
+    </w:p>
+    <w:p>
+      <w:pPr>
+        <w:rPr>
+          <w:rFonts w:ascii="Times New Roman" w:hAnsi="Times New Roman" w:cs="Times New Roman"/>
+          <w:b/>
+          <w:sz w:val="32"/>
+          <w:szCs w:val="32"/>
+        </w:rPr>
+      </w:pPr>
+    </w:p>
+    <w:p>
+      <w:pPr>
+        <w:rPr>
+          <w:rFonts w:ascii="Times New Roman" w:hAnsi="Times New Roman" w:cs="Times New Roman"/>
+          <w:b/>
+          <w:sz w:val="32"/>
+          <w:szCs w:val="32"/>
+        </w:rPr>
+      </w:pPr>
+    </w:p>
+    <w:p>
+      <w:pPr>
+        <w:rPr>
+          <w:rFonts w:ascii="Times New Roman" w:hAnsi="Times New Roman" w:cs="Times New Roman"/>
+          <w:b/>
+          <w:sz w:val="32"/>
+          <w:szCs w:val="32"/>
+        </w:rPr>
+      </w:pPr>
+    </w:p>
+    <w:p>
+      <w:pPr>
+        <w:rPr>
+          <w:rFonts w:ascii="Times New Roman" w:hAnsi="Times New Roman" w:cs="Times New Roman"/>
+          <w:b/>
+          <w:sz w:val="32"/>
+          <w:szCs w:val="32"/>
+        </w:rPr>
+      </w:pPr>
+    </w:p>
+    <w:p>
+      <w:pPr>
+        <w:rPr>
+          <w:rFonts w:ascii="Times New Roman" w:hAnsi="Times New Roman" w:cs="Times New Roman"/>
+          <w:b/>
+          <w:sz w:val="32"/>
+          <w:szCs w:val="32"/>
+        </w:rPr>
+      </w:pPr>
+    </w:p>
+    <w:p>
+      <w:pPr>
+        <w:rPr>
+          <w:rFonts w:ascii="Times New Roman" w:hAnsi="Times New Roman" w:cs="Times New Roman"/>
+          <w:b/>
+          <w:sz w:val="32"/>
+          <w:szCs w:val="32"/>
+        </w:rPr>
+      </w:pPr>
+      <w:r>
+        <w:rPr>
+          <w:rFonts w:ascii="Times New Roman" w:hAnsi="Times New Roman" w:cs="Times New Roman"/>
+          <w:b/>
+          <w:sz w:val="32"/>
+          <w:szCs w:val="32"/>
+        </w:rPr>
+        <w:t>Step7</w:t>
+      </w:r>
+      <w:r>
+        <w:rPr>
+          <w:rFonts w:ascii="Times New Roman" w:hAnsi="Times New Roman" w:cs="Times New Roman"/>
+          <w:b/>
+          <w:sz w:val="32"/>
+          <w:szCs w:val="32"/>
+        </w:rPr>
+        <w:t xml:space="preserve"> output:</w:t>
+      </w:r>
+    </w:p>
+    <w:p>
+      <w:r>
+        <w:rPr>
+          <w:noProof/>
+        </w:rPr>
         <w:drawing>
           <wp:inline distT="0" distB="0" distL="0" distR="0" wp14:anchorId="7CD45065" wp14:editId="15FB531D">
             <wp:extent cx="5943600" cy="4465955"/>
@@ -347,6 +811,394 @@
                     <a:xfrm>
                       <a:off x="0" y="0"/>
                       <a:ext cx="5943600" cy="4465955"/>
+                    </a:xfrm>
+                    <a:prstGeom prst="rect">
+                      <a:avLst/>
+                    </a:prstGeom>
+                  </pic:spPr>
+                </pic:pic>
+              </a:graphicData>
+            </a:graphic>
+          </wp:inline>
+        </w:drawing>
+      </w:r>
+    </w:p>
+    <w:p/>
+    <w:p>
+      <w:pPr>
+        <w:rPr>
+          <w:rFonts w:ascii="Times New Roman" w:hAnsi="Times New Roman" w:cs="Times New Roman"/>
+          <w:b/>
+          <w:sz w:val="32"/>
+          <w:szCs w:val="32"/>
+        </w:rPr>
+      </w:pPr>
+    </w:p>
+    <w:p>
+      <w:pPr>
+        <w:rPr>
+          <w:rFonts w:ascii="Times New Roman" w:hAnsi="Times New Roman" w:cs="Times New Roman"/>
+          <w:b/>
+          <w:sz w:val="32"/>
+          <w:szCs w:val="32"/>
+        </w:rPr>
+      </w:pPr>
+    </w:p>
+    <w:p>
+      <w:pPr>
+        <w:rPr>
+          <w:rFonts w:ascii="Times New Roman" w:hAnsi="Times New Roman" w:cs="Times New Roman"/>
+          <w:b/>
+          <w:sz w:val="32"/>
+          <w:szCs w:val="32"/>
+        </w:rPr>
+      </w:pPr>
+    </w:p>
+    <w:p>
+      <w:pPr>
+        <w:rPr>
+          <w:rFonts w:ascii="Times New Roman" w:hAnsi="Times New Roman" w:cs="Times New Roman"/>
+          <w:b/>
+          <w:sz w:val="32"/>
+          <w:szCs w:val="32"/>
+        </w:rPr>
+      </w:pPr>
+      <w:r>
+        <w:rPr>
+          <w:rFonts w:ascii="Times New Roman" w:hAnsi="Times New Roman" w:cs="Times New Roman"/>
+          <w:b/>
+          <w:sz w:val="32"/>
+          <w:szCs w:val="32"/>
+        </w:rPr>
+        <w:lastRenderedPageBreak/>
+        <w:t>Step8</w:t>
+      </w:r>
+      <w:r>
+        <w:rPr>
+          <w:rFonts w:ascii="Times New Roman" w:hAnsi="Times New Roman" w:cs="Times New Roman"/>
+          <w:b/>
+          <w:sz w:val="32"/>
+          <w:szCs w:val="32"/>
+        </w:rPr>
+        <w:t xml:space="preserve"> output:</w:t>
+      </w:r>
+    </w:p>
+    <w:p/>
+    <w:p>
+      <w:r>
+        <w:rPr>
+          <w:noProof/>
+        </w:rPr>
+        <w:drawing>
+          <wp:inline distT="0" distB="0" distL="0" distR="0" wp14:anchorId="38AA1C8F" wp14:editId="164140FC">
+            <wp:extent cx="5943600" cy="4986655"/>
+            <wp:effectExtent l="0" t="0" r="0" b="4445"/>
+            <wp:docPr id="2" name="Picture 2"/>
+            <wp:cNvGraphicFramePr>
+              <a:graphicFrameLocks xmlns:a="http://schemas.openxmlformats.org/drawingml/2006/main" noChangeAspect="1"/>
+            </wp:cNvGraphicFramePr>
+            <a:graphic xmlns:a="http://schemas.openxmlformats.org/drawingml/2006/main">
+              <a:graphicData uri="http://schemas.openxmlformats.org/drawingml/2006/picture">
+                <pic:pic xmlns:pic="http://schemas.openxmlformats.org/drawingml/2006/picture">
+                  <pic:nvPicPr>
+                    <pic:cNvPr id="1" name=""/>
+                    <pic:cNvPicPr/>
+                  </pic:nvPicPr>
+                  <pic:blipFill>
+                    <a:blip r:embed="rId12"/>
+                    <a:stretch>
+                      <a:fillRect/>
+                    </a:stretch>
+                  </pic:blipFill>
+                  <pic:spPr>
+                    <a:xfrm>
+                      <a:off x="0" y="0"/>
+                      <a:ext cx="5943600" cy="4986655"/>
+                    </a:xfrm>
+                    <a:prstGeom prst="rect">
+                      <a:avLst/>
+                    </a:prstGeom>
+                  </pic:spPr>
+                </pic:pic>
+              </a:graphicData>
+            </a:graphic>
+          </wp:inline>
+        </w:drawing>
+      </w:r>
+    </w:p>
+    <w:p/>
+    <w:p>
+      <w:pPr>
+        <w:rPr>
+          <w:rFonts w:ascii="Times New Roman" w:hAnsi="Times New Roman" w:cs="Times New Roman"/>
+          <w:b/>
+          <w:sz w:val="32"/>
+          <w:szCs w:val="32"/>
+        </w:rPr>
+      </w:pPr>
+    </w:p>
+    <w:p>
+      <w:pPr>
+        <w:rPr>
+          <w:rFonts w:ascii="Times New Roman" w:hAnsi="Times New Roman" w:cs="Times New Roman"/>
+          <w:b/>
+          <w:sz w:val="32"/>
+          <w:szCs w:val="32"/>
+        </w:rPr>
+      </w:pPr>
+    </w:p>
+    <w:p>
+      <w:pPr>
+        <w:rPr>
+          <w:rFonts w:ascii="Times New Roman" w:hAnsi="Times New Roman" w:cs="Times New Roman"/>
+          <w:b/>
+          <w:sz w:val="32"/>
+          <w:szCs w:val="32"/>
+        </w:rPr>
+      </w:pPr>
+    </w:p>
+    <w:p>
+      <w:pPr>
+        <w:rPr>
+          <w:rFonts w:ascii="Times New Roman" w:hAnsi="Times New Roman" w:cs="Times New Roman"/>
+          <w:b/>
+          <w:sz w:val="32"/>
+          <w:szCs w:val="32"/>
+        </w:rPr>
+      </w:pPr>
+    </w:p>
+    <w:p>
+      <w:pPr>
+        <w:rPr>
+          <w:rFonts w:ascii="Times New Roman" w:hAnsi="Times New Roman" w:cs="Times New Roman"/>
+          <w:b/>
+          <w:sz w:val="32"/>
+          <w:szCs w:val="32"/>
+        </w:rPr>
+      </w:pPr>
+    </w:p>
+    <w:p>
+      <w:pPr>
+        <w:rPr>
+          <w:rFonts w:ascii="Times New Roman" w:hAnsi="Times New Roman" w:cs="Times New Roman"/>
+          <w:b/>
+          <w:sz w:val="32"/>
+          <w:szCs w:val="32"/>
+        </w:rPr>
+      </w:pPr>
+    </w:p>
+    <w:p>
+      <w:pPr>
+        <w:rPr>
+          <w:rFonts w:ascii="Times New Roman" w:hAnsi="Times New Roman" w:cs="Times New Roman"/>
+          <w:b/>
+          <w:sz w:val="32"/>
+          <w:szCs w:val="32"/>
+        </w:rPr>
+      </w:pPr>
+      <w:r>
+        <w:rPr>
+          <w:rFonts w:ascii="Times New Roman" w:hAnsi="Times New Roman" w:cs="Times New Roman"/>
+          <w:b/>
+          <w:sz w:val="32"/>
+          <w:szCs w:val="32"/>
+        </w:rPr>
+        <w:lastRenderedPageBreak/>
+        <w:t>Step9</w:t>
+      </w:r>
+      <w:r>
+        <w:rPr>
+          <w:rFonts w:ascii="Times New Roman" w:hAnsi="Times New Roman" w:cs="Times New Roman"/>
+          <w:b/>
+          <w:sz w:val="32"/>
+          <w:szCs w:val="32"/>
+        </w:rPr>
+        <w:t xml:space="preserve"> output:</w:t>
+      </w:r>
+    </w:p>
+    <w:p/>
+    <w:p>
+      <w:r>
+        <w:rPr>
+          <w:noProof/>
+        </w:rPr>
+        <w:drawing>
+          <wp:inline distT="0" distB="0" distL="0" distR="0" wp14:anchorId="703D9BB4" wp14:editId="578A0771">
+            <wp:extent cx="5943600" cy="4651375"/>
+            <wp:effectExtent l="0" t="0" r="0" b="0"/>
+            <wp:docPr id="10" name="Picture 10"/>
+            <wp:cNvGraphicFramePr>
+              <a:graphicFrameLocks xmlns:a="http://schemas.openxmlformats.org/drawingml/2006/main" noChangeAspect="1"/>
+            </wp:cNvGraphicFramePr>
+            <a:graphic xmlns:a="http://schemas.openxmlformats.org/drawingml/2006/main">
+              <a:graphicData uri="http://schemas.openxmlformats.org/drawingml/2006/picture">
+                <pic:pic xmlns:pic="http://schemas.openxmlformats.org/drawingml/2006/picture">
+                  <pic:nvPicPr>
+                    <pic:cNvPr id="1" name=""/>
+                    <pic:cNvPicPr/>
+                  </pic:nvPicPr>
+                  <pic:blipFill>
+                    <a:blip r:embed="rId13"/>
+                    <a:stretch>
+                      <a:fillRect/>
+                    </a:stretch>
+                  </pic:blipFill>
+                  <pic:spPr>
+                    <a:xfrm>
+                      <a:off x="0" y="0"/>
+                      <a:ext cx="5943600" cy="4651375"/>
+                    </a:xfrm>
+                    <a:prstGeom prst="rect">
+                      <a:avLst/>
+                    </a:prstGeom>
+                  </pic:spPr>
+                </pic:pic>
+              </a:graphicData>
+            </a:graphic>
+          </wp:inline>
+        </w:drawing>
+      </w:r>
+    </w:p>
+    <w:p/>
+    <w:p>
+      <w:pPr>
+        <w:rPr>
+          <w:rFonts w:ascii="Times New Roman" w:hAnsi="Times New Roman" w:cs="Times New Roman"/>
+          <w:b/>
+          <w:sz w:val="32"/>
+          <w:szCs w:val="32"/>
+        </w:rPr>
+      </w:pPr>
+    </w:p>
+    <w:p>
+      <w:pPr>
+        <w:rPr>
+          <w:rFonts w:ascii="Times New Roman" w:hAnsi="Times New Roman" w:cs="Times New Roman"/>
+          <w:b/>
+          <w:sz w:val="32"/>
+          <w:szCs w:val="32"/>
+        </w:rPr>
+      </w:pPr>
+    </w:p>
+    <w:p>
+      <w:pPr>
+        <w:rPr>
+          <w:rFonts w:ascii="Times New Roman" w:hAnsi="Times New Roman" w:cs="Times New Roman"/>
+          <w:b/>
+          <w:sz w:val="32"/>
+          <w:szCs w:val="32"/>
+        </w:rPr>
+      </w:pPr>
+    </w:p>
+    <w:p>
+      <w:pPr>
+        <w:rPr>
+          <w:rFonts w:ascii="Times New Roman" w:hAnsi="Times New Roman" w:cs="Times New Roman"/>
+          <w:b/>
+          <w:sz w:val="32"/>
+          <w:szCs w:val="32"/>
+        </w:rPr>
+      </w:pPr>
+    </w:p>
+    <w:p>
+      <w:pPr>
+        <w:rPr>
+          <w:rFonts w:ascii="Times New Roman" w:hAnsi="Times New Roman" w:cs="Times New Roman"/>
+          <w:b/>
+          <w:sz w:val="32"/>
+          <w:szCs w:val="32"/>
+        </w:rPr>
+      </w:pPr>
+    </w:p>
+    <w:p>
+      <w:pPr>
+        <w:rPr>
+          <w:rFonts w:ascii="Times New Roman" w:hAnsi="Times New Roman" w:cs="Times New Roman"/>
+          <w:b/>
+          <w:sz w:val="32"/>
+          <w:szCs w:val="32"/>
+        </w:rPr>
+      </w:pPr>
+    </w:p>
+    <w:p>
+      <w:pPr>
+        <w:rPr>
+          <w:rFonts w:ascii="Times New Roman" w:hAnsi="Times New Roman" w:cs="Times New Roman"/>
+          <w:b/>
+          <w:sz w:val="32"/>
+          <w:szCs w:val="32"/>
+        </w:rPr>
+      </w:pPr>
+    </w:p>
+    <w:p>
+      <w:pPr>
+        <w:rPr>
+          <w:rFonts w:ascii="Times New Roman" w:hAnsi="Times New Roman" w:cs="Times New Roman"/>
+          <w:b/>
+          <w:sz w:val="32"/>
+          <w:szCs w:val="32"/>
+        </w:rPr>
+      </w:pPr>
+      <w:r>
+        <w:rPr>
+          <w:rFonts w:ascii="Times New Roman" w:hAnsi="Times New Roman" w:cs="Times New Roman"/>
+          <w:b/>
+          <w:sz w:val="32"/>
+          <w:szCs w:val="32"/>
+        </w:rPr>
+        <w:lastRenderedPageBreak/>
+        <w:t>Step1</w:t>
+      </w:r>
+      <w:r>
+        <w:rPr>
+          <w:rFonts w:ascii="Times New Roman" w:hAnsi="Times New Roman" w:cs="Times New Roman"/>
+          <w:b/>
+          <w:sz w:val="32"/>
+          <w:szCs w:val="32"/>
+        </w:rPr>
+        <w:t>0</w:t>
+      </w:r>
+      <w:r>
+        <w:rPr>
+          <w:rFonts w:ascii="Times New Roman" w:hAnsi="Times New Roman" w:cs="Times New Roman"/>
+          <w:b/>
+          <w:sz w:val="32"/>
+          <w:szCs w:val="32"/>
+        </w:rPr>
+        <w:t xml:space="preserve"> output:</w:t>
+      </w:r>
+    </w:p>
+    <w:p/>
+    <w:p>
+      <w:r>
+        <w:rPr>
+          <w:noProof/>
+        </w:rPr>
+        <w:drawing>
+          <wp:inline distT="0" distB="0" distL="0" distR="0" wp14:anchorId="710A6874" wp14:editId="653F114B">
+            <wp:extent cx="5943600" cy="4980305"/>
+            <wp:effectExtent l="0" t="0" r="0" b="0"/>
+            <wp:docPr id="11" name="Picture 11"/>
+            <wp:cNvGraphicFramePr>
+              <a:graphicFrameLocks xmlns:a="http://schemas.openxmlformats.org/drawingml/2006/main" noChangeAspect="1"/>
+            </wp:cNvGraphicFramePr>
+            <a:graphic xmlns:a="http://schemas.openxmlformats.org/drawingml/2006/main">
+              <a:graphicData uri="http://schemas.openxmlformats.org/drawingml/2006/picture">
+                <pic:pic xmlns:pic="http://schemas.openxmlformats.org/drawingml/2006/picture">
+                  <pic:nvPicPr>
+                    <pic:cNvPr id="1" name=""/>
+                    <pic:cNvPicPr/>
+                  </pic:nvPicPr>
+                  <pic:blipFill>
+                    <a:blip r:embed="rId14"/>
+                    <a:stretch>
+                      <a:fillRect/>
+                    </a:stretch>
+                  </pic:blipFill>
+                  <pic:spPr>
+                    <a:xfrm>
+                      <a:off x="0" y="0"/>
+                      <a:ext cx="5943600" cy="4980305"/>
                     </a:xfrm>
                     <a:prstGeom prst="rect">
                       <a:avLst/>
@@ -764,6 +1616,7 @@
   <w:style w:type="paragraph" w:default="1" w:styleId="Normal">
     <w:name w:val="Normal"/>
     <w:qFormat/>
+    <w:rsid w:val="00090DA1"/>
   </w:style>
   <w:style w:type="character" w:default="1" w:styleId="DefaultParagraphFont">
     <w:name w:val="Default Paragraph Font"/>

</xml_diff>